<commit_message>
docs: Beschreibung auf Google-Maps-Kartensuche aktualisiert (statt OSM-Karte)
Co-Authored-By: Claude Opus 5.5 <noreply@anthropic.com>
</commit_message>
<xml_diff>
--- a/share/Pfadfinder Beschreibung.docx
+++ b/share/Pfadfinder Beschreibung.docx
@@ -212,7 +212,7 @@
         <w:pStyle w:val="ListBullet"/>
       </w:pPr>
       <w:r>
-        <w:t>Live-Buttons zu offiziellen Quellen: Stellensuche der Bundesagentur für Arbeit (mit eigener PLZ und Umkreis), eine OpenStreetMap-Karte mit Betrieben in der Nähe sowie der vollständige BERUFENET-Eintrag.</w:t>
+        <w:t>Live-Buttons zu offiziellen Quellen: Stellensuche der Bundesagentur für Arbeit (mit eigener PLZ und Umkreis), eine Kartensuche (Google Maps) nach passenden Betrieben in der Nähe sowie der vollständige BERUFENET-Eintrag.</w:t>
       </w:r>
     </w:p>
     <w:p>
@@ -255,7 +255,7 @@
         <w:pStyle w:val="ListBullet"/>
       </w:pPr>
       <w:r>
-        <w:t>Externe Seiten (Arbeitsagentur, OpenStreetMap) öffnen sich nur, wenn man aktiv auf einen Button klickt.</w:t>
+        <w:t>Externe Seiten (Arbeitsagentur, Google Maps) öffnen sich nur, wenn man aktiv auf einen Button klickt.</w:t>
       </w:r>
     </w:p>
     <w:p>

</xml_diff>